<commit_message>
Simplificar el formulario V.03 de fiscalización de estaciones de servicio
Datos en 3 filas, revisión visual en 3 columnas, guía de llenado más corta
y procedimiento del técnico reducido de 9 a 6 puntos; deja margen libre
en cada una de las 2 hojas. Se actualizan las notas de ajuste.

Co-Authored-By: Claude Opus 5.5 <noreply@anthropic.com>
Claude-Session: https://claude.ai/code/session_0111R6MkCePAtRWzpCuQBqL7
</commit_message>
<xml_diff>
--- a/notas_ajuste_formulario_V03.docx
+++ b/notas_ajuste_formulario_V03.docx
@@ -189,7 +189,7 @@
           <w:sz w:val="20"/>
           <w:szCs w:val="20"/>
         </w:rPr>
-        <w:t xml:space="preserve">No hay decisión por manguera, ni hora de término, ni representante de la estación que reciba copia.</w:t>
+        <w:t xml:space="preserve">No hay decisión por manguera ni representante de la estación que reciba copia.</w:t>
       </w:r>
     </w:p>
     <w:p>
@@ -374,7 +374,7 @@
                 <w:sz w:val="18"/>
                 <w:szCs w:val="18"/>
               </w:rPr>
-              <w:t xml:space="preserve">Una fila por manguera: 5 revisiones visuales con ✓ / ✗ / NA y 3 ensayos anotados en ml</w:t>
+              <w:t xml:space="preserve">Una fila por manguera: 3 revisiones visuales con ✓ / ✗ / NA y 3 ensayos anotados en ml</w:t>
             </w:r>
           </w:p>
         </w:tc>
@@ -569,7 +569,7 @@
                 <w:sz w:val="18"/>
                 <w:szCs w:val="18"/>
               </w:rPr>
-              <w:t xml:space="preserve">Los pasos del técnico quedan en 9 líneas cortas (sección 3), con la referencia 9.3.x.x al procedimiento</w:t>
+              <w:t xml:space="preserve">Los pasos del técnico quedan en 6 líneas cortas (sección 3), con la referencia 9.3.x.x al procedimiento</w:t>
             </w:r>
           </w:p>
         </w:tc>
@@ -699,7 +699,7 @@
                 <w:sz w:val="18"/>
                 <w:szCs w:val="18"/>
               </w:rPr>
-              <w:t xml:space="preserve">Estación, ciudad, hora de inicio y término, temperatura, último certificado y mangueras inspeccionadas</w:t>
+              <w:t xml:space="preserve">Estación, ciudad, fecha y hora, tipo de servicio, temperatura y N° del último certificado</w:t>
             </w:r>
           </w:p>
         </w:tc>
@@ -1902,7 +1902,7 @@
         </w:numPr>
         <w:spacing w:after="40"/>
       </w:pPr>
-      <w:hyperlink w:history="1" r:id="rIdnraw2crsgfv668kdmjq1w">
+      <w:hyperlink w:history="1" r:id="rIdwsi3qjq_meb62bnmnbeuu">
         <w:r>
           <w:rPr>
             <w:rStyle w:val="Hyperlink"/>
@@ -1923,7 +1923,7 @@
         </w:numPr>
         <w:spacing w:after="40"/>
       </w:pPr>
-      <w:hyperlink w:history="1" r:id="rIdqm4sc0h-dnqwbkjevxfbf">
+      <w:hyperlink w:history="1" r:id="rIdczu3qpjvymir2b_onto8q">
         <w:r>
           <w:rPr>
             <w:rStyle w:val="Hyperlink"/>
@@ -1944,7 +1944,7 @@
         </w:numPr>
         <w:spacing w:after="40"/>
       </w:pPr>
-      <w:hyperlink w:history="1" r:id="rIdt6pqhq9lmldsaavyha5yr">
+      <w:hyperlink w:history="1" r:id="rIdqcw9bupllxjwdd7yg_vv0">
         <w:r>
           <w:rPr>
             <w:rStyle w:val="Hyperlink"/>
@@ -1965,7 +1965,7 @@
         </w:numPr>
         <w:spacing w:after="40"/>
       </w:pPr>
-      <w:hyperlink w:history="1" r:id="rIdwdpgilqnca4n2wkqncgmi">
+      <w:hyperlink w:history="1" r:id="rIdpxcjqjj_e_jgu4dbtzn9p">
         <w:r>
           <w:rPr>
             <w:rStyle w:val="Hyperlink"/>
@@ -1986,7 +1986,7 @@
         </w:numPr>
         <w:spacing w:after="40"/>
       </w:pPr>
-      <w:hyperlink w:history="1" r:id="rIdgrrcsusmb4pz9ga8e9dt5">
+      <w:hyperlink w:history="1" r:id="rIdcodeecudhykkpjjnutrtb">
         <w:r>
           <w:rPr>
             <w:rStyle w:val="Hyperlink"/>
@@ -2007,7 +2007,7 @@
         </w:numPr>
         <w:spacing w:after="40"/>
       </w:pPr>
-      <w:hyperlink w:history="1" r:id="rIdah4yz0se6a5px6tz1pkdc">
+      <w:hyperlink w:history="1" r:id="rIdbygckqaudzer4qom_uw_l">
         <w:r>
           <w:rPr>
             <w:rStyle w:val="Hyperlink"/>
@@ -2028,7 +2028,7 @@
         </w:numPr>
         <w:spacing w:after="40"/>
       </w:pPr>
-      <w:hyperlink w:history="1" r:id="rIdg3f4geneinkk1xhthwux8">
+      <w:hyperlink w:history="1" r:id="rIdcssyatmahf4lrzizmotwb">
         <w:r>
           <w:rPr>
             <w:rStyle w:val="Hyperlink"/>
@@ -2049,7 +2049,7 @@
         </w:numPr>
         <w:spacing w:after="40"/>
       </w:pPr>
-      <w:hyperlink w:history="1" r:id="rIduz-eefhd9r2ugitarrtx8">
+      <w:hyperlink w:history="1" r:id="rIddojwupk7ywmxluqifn1ut">
         <w:r>
           <w:rPr>
             <w:rStyle w:val="Hyperlink"/>
@@ -2070,7 +2070,7 @@
         </w:numPr>
         <w:spacing w:after="40"/>
       </w:pPr>
-      <w:hyperlink w:history="1" r:id="rIdojupk_sffq-sauvcyzvx6">
+      <w:hyperlink w:history="1" r:id="rIdl4wsfz8kxy5sr_yzi4phd">
         <w:r>
           <w:rPr>
             <w:rStyle w:val="Hyperlink"/>

</xml_diff>